<commit_message>
Clarify empirical background versus ethical contribution validation
</commit_message>
<xml_diff>
--- a/research/user_reinforced_domestic_revision_20261029/AI导购理由撤回后的预算重审_补强稿国内数据版.docx
+++ b/research/user_reinforced_domestic_revision_20261029/AI导购理由撤回后的预算重审_补强稿国内数据版.docx
@@ -1327,7 +1327,7 @@
           <w:color w:val="000000"/>
           <w:sz w:val="23"/>
         </w:rPr>
-        <w:t xml:space="preserve">本模块不包含理由撤回、预算重审、实际控件使用或操作成本，承接的是平均评价与特定问题缓解应分别检验的要求。撤回信息与直接提供相反信息的区分[19]、选择负担的情境差异[20]继续作为规范讨论的文献背景，不为本数据补入未测参数。</w:t>
+        <w:t xml:space="preserve">本仿真不检验完整伦理方案，而是为方案提供经验背景；核心创新仍由规范推理、配对规范案例和边界条件论证完成。原六臂未设置理由撤回、独立理由或撤回后知情重申的预算历史条件，也未比较普通事实纠错、一般再确认和元偏好反思。配对规范案例用于判断一致性与反例边界，不等同真人实验验证。撤回信息与相反信息的区分[19]、选择负担的情境差异[20]作为规范背景，不提供未测参数。</w:t>
       </w:r>
     </w:p>
     <w:p>
@@ -5304,7 +5304,7 @@
           <w:color w:val="000000"/>
           <w:sz w:val="23"/>
         </w:rPr>
-        <w:t xml:space="preserve">这项责任以改善决定条件为目的，预算更新仍须符合消费者的有效表达和授权。必要纠错不自动恢复已拒绝的商业推动，较强的既有再确认也可以实现相同要求。条件规范判准与可核案例承担责任辩护；国内真人实验复分析分别报告平均信任差和特定差距变化，约束措施的验收口径。预算重审对真实理解、决定及净负担的实际效果，留待直接包含这些变量的匹配任务研究。</w:t>
+        <w:t xml:space="preserve">这项责任以改善决定条件为目的，预算更新仍须符合消费者的有效表达和授权。必要纠错不自动恢复已拒绝的商业推动，较强的既有再确认也可以实现相同要求。规范推理、配对规范案例与边界条件承担核心创新论证。国内六臂复分析提供经验背景，未直接比较按本判准设计的措施与普通事实纠错、一般再确认或元偏好反思的效果。预算重审对真实理解、决定及净负担的实际效果，留待直接包含这些变量的匹配任务研究。</w:t>
       </w:r>
     </w:p>
     <w:p>

</xml_diff>

<commit_message>
Strengthen correction-duty argument and direct validation design
</commit_message>
<xml_diff>
--- a/research/user_reinforced_domestic_revision_20261029/AI导购理由撤回后的预算重审_补强稿国内数据版.docx
+++ b/research/user_reinforced_domestic_revision_20261029/AI导购理由撤回后的预算重审_补强稿国内数据版.docx
@@ -1407,7 +1407,7 @@
           <w:color w:val="000000"/>
           <w:sz w:val="23"/>
         </w:rPr>
-        <w:t>修复责任的最低内容是交代依据状态、说明已知的预算关联，并保留可执行的选择机会。普通更正已完成这些功能时，无须另设确认关卡。例如：“这项安全优势目前缺少可靠支持。你先前表示主要为此将预算从150元提高至200元；你可以维持200元、调整预算或先不买。”这是一条构造的合格表达，具体交互也可用更简短的等效方式完成。收到新的有效表达前，系统仍按当前预算执行；用户无需通过理解测验或额外确认才能继续。解释内容、时点与方式随缺口配置。[4]</w:t>
+        <w:t xml:space="preserve">修复应分别回应说明缺口和操作缺口。依据变化或已知预算关联尚未清楚时，补充针对性说明；关联已说明而修改、结束无法生效时，修复操作并提供可用替代，重复解释不能代替兑现。普通更正已完成说明且选择可用时，无须另设确认关卡。例如：“这项安全优势目前缺少可靠支持。你先前表示主要为此提高预算；可以维持200元、调整或先不买。”收到新的有效表达前，仍按当前预算执行，用户无需通过理解测验。解释内容、时点与方式随缺口配置。[4]</w:t>
       </w:r>
     </w:p>
     <w:p>
@@ -1435,7 +1435,7 @@
           <w:color w:val="000000"/>
           <w:sz w:val="23"/>
         </w:rPr>
-        <w:t>独立理由与知情重申进一步限定提醒。消费者明确说明即使没有安全优势，仍因外观或其他理由接受200元，并已清楚获知更正意义时，应承接其选择。仅出现“蓝色”一词，不能证明独立理由足以维持预算；沉默也不等于重申。规则要求的是回应尚存缺口，而非反复检查消费者是否作出系统偏好的答案。</w:t>
+        <w:t xml:space="preserve">独立理由与知情重申限制的是同一信息的重复预算邀请。消费者已清楚获知更正意义，明确即使没有安全优势仍愿为外观维持200元，应承接其选择。仅出现“蓝色”一词，不能证明独立理由足够；沉默也不等于重申。独立理由不免除必要事实更正，停止重复说明也不等于失灵操作已修好。规则回应具体缺口，不要求消费者给出系统偏好的答案。</w:t>
       </w:r>
     </w:p>
     <w:p>
@@ -2227,7 +2227,7 @@
           <w:color w:val="000000"/>
           <w:sz w:val="23"/>
         </w:rPr>
-        <w:t>构造反例进一步限制判准。消费者已明确表示即使安全没有优势仍愿为颜色加价，不能以保护为由迫使其降预算；消费者收到清楚更正后维持200元，也不需要反复说明私人生活安排。另一反例是更正已经交代关联，只是没有再问预算。若研究者唯一批评是少了一个确认问题，判准便偏离修复功能，应该承认该回复已经完成相应责任。</w:t>
+        <w:t xml:space="preserve">构造反例进一步限制判准。已清楚获知更正且愿为颜色保留200元的消费者，无须反复说明私人生活安排；普通更正已交代关联并保持选择可用，也无须再问预算。另一反例是关联已说明，但修改入口失灵：此时应修复操作或提供替代，不能重复解释冒充完成。独立理由可以支持原预算，却不使未更正的无据断言成为事实。针对性反例检查据此将说明、操作和重复邀请分开，不按最后是否省钱评价成功。</w:t>
       </w:r>
     </w:p>
     <w:p>
@@ -5268,7 +5268,7 @@
           <w:color w:val="000000"/>
           <w:sz w:val="23"/>
         </w:rPr>
-        <w:t xml:space="preserve">当前证据形成条件判准、限定系统响应与国内二手实验复分析：给定历史的真实回复没有呈现自然错误怎样促成真人提价，国内记忆面板实验测量即时信任，未包含预算修订、实际控件使用或操作负担。校园及社区便利样本的解释范围也有边界。后续可在有同意的匹配任务中比较普通更正、已完成关联说明的更正及追加提示，分别测重要取舍理解、维持或修改预算的理由、执行情况、时间和负担；样本量依目标精度或功效另定。再依具体失败扩展跨平台状态审计与数字能力差异，落实适用伦理审查和隐私安排。增加重抽样次数不能补出这些未测变量。</w:t>
+        <w:t xml:space="preserve">当前证据形成条件判准、限定系统响应与国内二手实验复分析。15项定向反例检查收紧了说明、操作和停止条件；原9轮元宝记录保留成功响应、措辞歧义及后台状态未知。国内面板实验未测预算过程。本轮定向检索未取得同时包含理由撤回、同人预算变化、知情重申及措施比较的国内公开原数据。后续应将理由历史与响应措施分开，固定历史比较事实更正、一般再确认、元偏好反思及条件响应，并纳入功能充分的强纠错；若等价则保留等价结论。只有取得许可明确、过程变量匹配的国内二手资料，才开展对应估计，分别报告理解、决定、执行及负担。新真人研究另需伦理安排及样本依据；增加重抽样次数不能补出未测变量。</w:t>
       </w:r>
     </w:p>
     <w:p>
@@ -5290,7 +5290,7 @@
           <w:color w:val="000000"/>
           <w:sz w:val="23"/>
         </w:rPr>
-        <w:t>AI导购的重要理由撤回后，纠错应照顾消费者已经公开用于预算修订的相关使用。是否需要主动补充，取决于理由重要性、公开联系、可调整性、现有更正的完成情况与相称负担。普通更正已经使关联可理解并保留修改机会时，无须再设确认关卡；独立理由充分、知情重申及退出限制重复重审。</w:t>
+        <w:t xml:space="preserve">AI导购的重要理由撤回后，纠错应照顾消费者已经公开用于预算修订的相关使用。是否需要主动补充，取决于理由重要性、公开联系、可调整性、具体说明缺口与相称负担。普通更正已经使关联可理解并保留修改机会时，无须再设确认关卡；操作失灵另行修复。独立理由充分、知情重申及退出分别限制重复重审；其余更正与操作责任按拒绝范围、允许渠道和比例性另审。</w:t>
       </w:r>
     </w:p>
     <w:p>
@@ -5831,7 +5831,7 @@
           <w:color w:val="000000"/>
           <w:sz w:val="23"/>
         </w:rPr>
-        <w:t xml:space="preserve">当前独立仿真报告在research/domestic_simulation_report_20261029，采用同一批计算结果。旧虚拟与国外数据仿真已依用户要求从仓库当前文件移除。本次仅替换用户补强稿中相关证据及其上下文，没有重新运行主分析或扩写新的研究主线。</w:t>
+        <w:t xml:space="preserve">独立仿真报告见research/domestic_simulation_report_20261029，采用同一批计算结果。核心论证补强见research/direct_argument_validation_20261030：01为强近邻，02为检索，03列15项规范反例，04核读原9轮，05为直接比较设计。旧仿真仍从当前仓库移除，未新增消费者记录或重跑主分析。</w:t>
       </w:r>
     </w:p>
     <w:p>

</xml_diff>